<commit_message>
Anwendertexte und Server-Start an die Kanzlei-Regeln anpassen.
Vorstellung, Anleitung und Struktur sagen nicht mehr, eine EXE
zu kopieren. Modus 3 verlangt Rechtsform und Größe. Gemeinsames
Startmenü unter _Gemeinsam/llp_start; Pseudokrat bleibt lokal.

Co-authored-by: svensteiner <svensteiner@users.noreply.github.com>
</commit_message>
<xml_diff>
--- a/LLP Anhangspruefer - Vorstellung und Anleitung.docx
+++ b/LLP Anhangspruefer - Vorstellung und Anleitung.docx
@@ -59,7 +59,7 @@
           <w:color w:val="1F4E78"/>
           <w:sz w:val="26"/>
         </w:rPr>
-        <w:t>Drei Prüfungsstufen. Ein Klick. Alles auf Ihrem PC.</w:t>
+        <w:t>Drei Prüfungsstufen. Start über die Desktop-Verknüpfung. Das Programm bleibt auf dem Server.</w:t>
       </w:r>
     </w:p>
     <w:p>
@@ -97,7 +97,7 @@
                 <w:color w:val="1F4E78"/>
                 <w:sz w:val="22"/>
               </w:rPr>
-              <w:t>Ihre Daten bleiben, wo sie hingehören</w:t>
+              <w:t>Ihre Daten bleiben prüfungsintern. KI nur über den zentralen Microsoft-Foundry-Layer der Kanzlei. Kein stiller Wechsel auf ein anderes Modell. Schlüssel liegen nicht im Programm.</w:t>
             </w:r>
           </w:p>
           <w:p>
@@ -105,7 +105,6 @@
               <w:rPr>
                 <w:sz w:val="21"/>
               </w:rPr>
-              <w:t>Das Tool arbeitet vollständig auf Ihrem Rechner. Keine Cloud, kein Upload, keine Internetverbindung im Betrieb. Mandantenunterlagen verlassen den PC zu keinem Zeitpunkt – Verschwiegenheitspflicht und DSGVO sind konstruktiv abgesichert, nicht nur versprochen.</w:t>
             </w:r>
           </w:p>
         </w:tc>
@@ -368,7 +367,7 @@
         <w:rPr>
           <w:sz w:val="22"/>
         </w:rPr>
-        <w:t>Erkennt die Rechtsform: reine AG-Angaben entfallen bei einer GmbH automatisch</w:t>
+        <w:t>Zuerst Rechtsform und Größe wählen (GmbH oder AG, klein / mittel / groß). Fragen, die nicht gelten, sind n. a. (Rechtsgrund), nicht „fehlt“. Danach wird nur der Rest geprüft.</w:t>
       </w:r>
     </w:p>
     <w:p>
@@ -586,7 +585,7 @@
               <w:rPr>
                 <w:sz w:val="21"/>
               </w:rPr>
-              <w:t>Optionale lokale KI</w:t>
+              <w:t>Optionale Foundry-KI</w:t>
             </w:r>
           </w:p>
         </w:tc>
@@ -599,7 +598,7 @@
               <w:rPr>
                 <w:sz w:val="21"/>
               </w:rPr>
-              <w:t>Auf Wunsch entscheidet ein lokales Sprachmodell offene Punkte mit – ohne dass Daten den Rechner verlassen.</w:t>
+              <w:t>Offene Punkte kann der zentrale Foundry-Layer bewerten. Ist Foundry aus, bleibt die Heuristik. Kein stiller Wechsel auf Ollama oder ein anderes Modell.</w:t>
             </w:r>
           </w:p>
         </w:tc>
@@ -615,7 +614,7 @@
               <w:rPr>
                 <w:sz w:val="21"/>
               </w:rPr>
-              <w:t>Kein Setup</w:t>
+              <w:t>Einfacher Start</w:t>
             </w:r>
           </w:p>
         </w:tc>
@@ -629,7 +628,7 @@
               <w:rPr>
                 <w:sz w:val="21"/>
               </w:rPr>
-              <w:t>Eine EXE. Doppelklick. Kein Python, kein Admin, keine Installation.</w:t>
+              <w:t>Start über Starten.bat bzw. die Desktop-Verknüpfung. Keine EXE auf den PC kopieren. Python nur, wenn die IT es auf dem Server eingerichtet hat.</w:t>
             </w:r>
           </w:p>
         </w:tc>
@@ -724,7 +723,7 @@
         <w:rPr>
           <w:sz w:val="22"/>
         </w:rPr>
-        <w:t>Doppelklick auf „Installieren.bat“. Das Tool wird auf Ihren PC kopiert und legt eine Verknüpfung „Anhangsprüfer“ auf den Desktop.</w:t>
+        <w:t>Einmalig: Doppelklick auf „Installieren.bat“. Es wird nur eine Desktop-Verknüpfung angelegt. Das Programm wird nicht auf den PC kopiert.</w:t>
       </w:r>
     </w:p>
     <w:p>
@@ -736,7 +735,7 @@
         <w:rPr>
           <w:sz w:val="22"/>
         </w:rPr>
-        <w:t>Warum kopieren? Vom Netzlaufwerk startet es langsam (rund 60 Sekunden), lokal in etwa zwei.</w:t>
+        <w:t>Warum keine Kopie? Alle LLP-Tools bleiben auf dem Server. So ist immer die aktuelle Fassung in Gebrauch.</w:t>
       </w:r>
     </w:p>
     <w:p>
@@ -982,7 +981,7 @@
               <w:rPr>
                 <w:sz w:val="21"/>
               </w:rPr>
-              <w:t>Anhang</w:t>
+              <w:t>Anhang plus GmbH/AG und klein/mittel/groß</w:t>
             </w:r>
           </w:p>
         </w:tc>
@@ -1119,7 +1118,7 @@
           <w:color w:val="595959"/>
           <w:sz w:val="18"/>
         </w:rPr>
-        <w:t>LLP Wirtschaftsprüfung · Der Anhangsprüfer läuft vollständig lokal. Alle Ergebnisse sind Prüfungsunterstützung und vom Abschlussprüfer zu validieren.</w:t>
+        <w:t>LLP Wirtschaftsprüfung · KI nur über den zentralen Foundry-Layer. Ohne Foundry arbeitet das Tool mit der Heuristik. Alle Ergebnisse sind Prüfungsunterstützung und vom Abschlussprüfer zu validieren.</w:t>
       </w:r>
     </w:p>
     <w:sectPr>

</xml_diff>

<commit_message>
Alte Keyword-Engine abschalten: CLI nur noch zweistufig.
run_review.py verweist auf Starten.bat. Die Kommandozeile verlangt
Rechtsform und Größe und schreibt die Excel-Checkliste. Vorstellung
und llp_ai-Hinweis für andere Tools nachgezogen.

Co-authored-by: svensteiner <svensteiner@users.noreply.github.com>
</commit_message>
<xml_diff>
--- a/LLP Anhangspruefer - Vorstellung und Anleitung.docx
+++ b/LLP Anhangspruefer - Vorstellung und Anleitung.docx
@@ -364,10 +364,7 @@
         <w:spacing w:after="60"/>
       </w:pPr>
       <w:r>
-        <w:rPr>
-          <w:sz w:val="22"/>
-        </w:rPr>
-        <w:t>Zuerst Rechtsform und Größe wählen (GmbH oder AG, klein / mittel / groß). Fragen, die nicht gelten, sind n. a. (Rechtsgrund), nicht „fehlt“. Danach wird nur der Rest geprüft.</w:t>
+        <w:t>Zuerst Rechtsform und Größe wählen und bestätigen (GmbH oder AG, klein / mittel / groß). Ohne Bestätigung startet nichts. Es gibt kein stilles „unbekannt“. Fragen, die nicht gelten, sind n. a. (Rechtsgrund), nicht „fehlt“. Danach wird nur der Rest geprüft.</w:t>
       </w:r>
     </w:p>
     <w:p>
@@ -781,10 +778,7 @@
         <w:spacing w:after="60"/>
       </w:pPr>
       <w:r>
-        <w:rPr>
-          <w:sz w:val="22"/>
-        </w:rPr>
-        <w:t>Stufe anklicken, Unterlagen hochladen, starten. Das Ergebnis landet im Ordner „Ergebnisse“.</w:t>
+        <w:t>Stufe anklicken, Unterlagen hochladen (PDF oder Word). In Stufe 3 Gesellschaft bestätigen, dann starten. Das Ergebnis landet im Ordner „Ergebnisse“.</w:t>
       </w:r>
     </w:p>
     <w:p>
@@ -978,10 +972,7 @@
           </w:tcPr>
           <w:p>
             <w:r>
-              <w:rPr>
-                <w:sz w:val="21"/>
-              </w:rPr>
-              <w:t>Anhang plus GmbH/AG und klein/mittel/groß</w:t>
+              <w:t>Anhang (PDF oder Word) plus GmbH/AG und klein/mittel/groß, danach bestätigen</w:t>
             </w:r>
           </w:p>
         </w:tc>
@@ -1112,13 +1103,7 @@
         </w:pBdr>
       </w:pPr>
       <w:r>
-        <w:rPr>
-          <w:b w:val="0"/>
-          <w:i/>
-          <w:color w:val="595959"/>
-          <w:sz w:val="18"/>
-        </w:rPr>
-        <w:t>LLP Wirtschaftsprüfung · KI nur über den zentralen Foundry-Layer. Ohne Foundry arbeitet das Tool mit der Heuristik. Alle Ergebnisse sind Prüfungsunterstützung und vom Abschlussprüfer zu validieren.</w:t>
+        <w:t>LLP Wirtschaftsprüfung · KI nur über den bestehenden Foundry-Zugang (llp_ai). Status: Pruefen.bat. Ohne Foundry arbeitet das Tool mit der Heuristik. Alle Ergebnisse sind Prüfungsunterstützung und vom Abschlussprüfer zu validieren.</w:t>
       </w:r>
     </w:p>
     <w:sectPr>

</xml_diff>

<commit_message>
Modus 3 im Browser klicken und Anleitung angleichen.
Chrome prüft: Gesellschaft vorschlagen, ohne Häkchen kein Start,
Ergebnis ohne unbekannt. Die Word-Anleitung nennt dieselben
Kacheln, Tools_starten.bat und Pruefen.bat.

Co-authored-by: svensteiner <svensteiner@users.noreply.github.com>
</commit_message>
<xml_diff>
--- a/LLP Anhangspruefer - Vorstellung und Anleitung.docx
+++ b/LLP Anhangspruefer - Vorstellung und Anleitung.docx
@@ -343,7 +343,7 @@
         <w:rPr>
           <w:sz w:val="22"/>
         </w:rPr>
-        <w:t>Klare Verdikte: Ja · Fehlt · nicht anwendbar · Offen. Kein schwammiges „teilweise“</w:t>
+        <w:t>Klare Verdikte wie in Excel: Ja · Fehlt · n. a. · Offen. In der Oberfläche: Offen – Angabe gefunden / Offen – kein Hinweis / Fehlt / n. a. Kein schwammiges „teilweise“.</w:t>
       </w:r>
     </w:p>
     <w:p>
@@ -625,7 +625,7 @@
               <w:rPr>
                 <w:sz w:val="21"/>
               </w:rPr>
-              <w:t>Start über Starten.bat bzw. die Desktop-Verknüpfung. Keine EXE auf den PC kopieren. Python nur, wenn die IT es auf dem Server eingerichtet hat.</w:t>
+              <w:t>Start über Starten.bat, Tools_starten.bat oder die Desktop-Verknüpfung. Keine EXE auf den PC kopieren. Python nur, wenn die IT es auf dem Server eingerichtet hat.</w:t>
             </w:r>
           </w:p>
         </w:tc>
@@ -720,7 +720,7 @@
         <w:rPr>
           <w:sz w:val="22"/>
         </w:rPr>
-        <w:t>Einmalig: Doppelklick auf „Installieren.bat“. Es wird nur eine Desktop-Verknüpfung angelegt. Das Programm wird nicht auf den PC kopiert.</w:t>
+        <w:t>Einmalig: Doppelklick auf „Installieren.bat“. Es werden nur Desktop-Verknüpfungen angelegt („Anhangsprüfer“ und „LLP AI Tools“). Das Programm wird nicht auf den PC kopiert.</w:t>
       </w:r>
     </w:p>
     <w:p>
@@ -757,7 +757,7 @@
         <w:rPr>
           <w:sz w:val="22"/>
         </w:rPr>
-        <w:t>Doppelklick auf die Desktop-Verknüpfung. Der Browser öffnet sich automatisch.</w:t>
+        <w:t>Doppelklick auf die Desktop-Verknüpfung „Anhangsprüfer“. Der Browser öffnet sich automatisch. Alle LLP-Tools: „LLP AI Tools“ oder Tools_starten.bat (Text verbessern, Pseudokrat).</w:t>
       </w:r>
     </w:p>
     <w:p>
@@ -1103,7 +1103,7 @@
         </w:pBdr>
       </w:pPr>
       <w:r>
-        <w:t>LLP Wirtschaftsprüfung · KI nur über den bestehenden Foundry-Zugang (llp_ai). Status: Pruefen.bat. Ohne Foundry arbeitet das Tool mit der Heuristik. Alle Ergebnisse sind Prüfungsunterstützung und vom Abschlussprüfer zu validieren.</w:t>
+        <w:t>LLP Wirtschaftsprüfung · KI nur über den bestehenden Foundry-Zugang (llp_ai). Status ohne Schlüssel: _Gemeinsam\Pruefen.bat. Ohne Foundry arbeitet das Tool mit der Heuristik. Pseudokrat bleibt lokal. Alle Ergebnisse sind Prüfungsunterstützung und vom Abschlussprüfer zu validieren.</w:t>
       </w:r>
     </w:p>
     <w:sectPr>

</xml_diff>

<commit_message>
Share-Anleitung für alle LLP-Tools, Word-Text an den aktuellen Stand.
Kollegen finden in _Gemeinsam eine kurze Anleitung ohne Python.
Die Word-Vorstellung nennt Teil 1, die Foundry-Verknüpfung und das Tor.

Co-authored-by: svensteiner <svensteiner@users.noreply.github.com>
</commit_message>
<xml_diff>
--- a/LLP Anhangspruefer - Vorstellung und Anleitung.docx
+++ b/LLP Anhangspruefer - Vorstellung und Anleitung.docx
@@ -364,7 +364,7 @@
         <w:spacing w:after="60"/>
       </w:pPr>
       <w:r>
-        <w:t>Zuerst Rechtsform und Größe wählen und bestätigen (GmbH oder AG, klein / mittel / groß). Ohne Bestätigung startet nichts. Es gibt kein stilles „unbekannt“. Fragen, die nicht gelten, sind n. a. (Rechtsgrund), nicht „fehlt“. Danach wird nur der Rest geprüft.</w:t>
+        <w:t>Zuerst Rechtsform und Größe wählen und bestätigen (GmbH oder AG, klein / mittel / groß). Ohne Bestätigung startet nichts. Es gibt kein stilles „unbekannt“. Nach der Auswahl zeigt Teil 1, wie viele Fragen gelten. Fragen, die nicht gelten, sind n. a. (Rechtsgrund), nicht „fehlt“. Danach wird nur der Rest geprüft.</w:t>
       </w:r>
     </w:p>
     <w:p>
@@ -720,7 +720,7 @@
         <w:rPr>
           <w:sz w:val="22"/>
         </w:rPr>
-        <w:t>Einmalig: Doppelklick auf „Installieren.bat“. Es werden nur Desktop-Verknüpfungen angelegt („Anhangsprüfer“ und „LLP AI Tools“). Das Programm wird nicht auf den PC kopiert.</w:t>
+        <w:t>Einmalig: Doppelklick auf „Installieren.bat“. Es werden nur Desktop-Verknüpfungen angelegt („Anhangsprüfer“, „LLP AI Tools“ und „Text verbessern“). Das Programm wird nicht auf den PC kopiert.</w:t>
       </w:r>
     </w:p>
     <w:p>
@@ -757,7 +757,7 @@
         <w:rPr>
           <w:sz w:val="22"/>
         </w:rPr>
-        <w:t>Doppelklick auf die Desktop-Verknüpfung „Anhangsprüfer“. Der Browser öffnet sich automatisch. Alle LLP-Tools: „LLP AI Tools“ oder Tools_starten.bat. „Text verbessern“ auf dem Desktop ist nur Foundry, nicht Mistral. Zum Beenden dort den Knopf Beenden.</w:t>
+        <w:t>Doppelklick auf die Desktop-Verknüpfung „Anhangsprüfer“. Der Browser öffnet sich automatisch. Alle LLP-Tools: „LLP AI Tools“ oder Tools_starten.bat. „Text verbessern“ auf dem Desktop ist nur Foundry, nicht Mistral. TEXT VERBESSERN.cmd im Tool-Ordner ist dasselbe Foundry-Tor, nicht Mistral. Zum Beenden dort den Knopf Beenden. Kurzanleitung auf dem Share: _Gemeinsam\ANLEITUNG.txt.</w:t>
       </w:r>
     </w:p>
     <w:p>
@@ -778,7 +778,7 @@
         <w:spacing w:after="60"/>
       </w:pPr>
       <w:r>
-        <w:t>Stufe anklicken, Unterlagen hochladen (PDF oder Word). In Stufe 3 Gesellschaft bestätigen, dann starten. Das Ergebnis landet im Ordner „Ergebnisse“.</w:t>
+        <w:t>Stufe anklicken, Unterlagen hochladen (PDF oder Word). In Stufe 3 Gesellschaft bestätigen. Teil 1 zeigt die Zahl der Fragen, dann starten. Das Ergebnis landet im Ordner „Ergebnisse“.</w:t>
       </w:r>
     </w:p>
     <w:p>

</xml_diff>

<commit_message>
start_windows.ps1 öffnet nur noch die Foundry-Seite, nicht Streamlit/Mistral.
Anwenden.bat ersetzt das offizielle Windows-Startskript. Anleitungen nennen Teil 2: Rest prüfen.

Co-authored-by: svensteiner <svensteiner@users.noreply.github.com>
</commit_message>
<xml_diff>
--- a/LLP Anhangspruefer - Vorstellung und Anleitung.docx
+++ b/LLP Anhangspruefer - Vorstellung und Anleitung.docx
@@ -364,7 +364,7 @@
         <w:spacing w:after="60"/>
       </w:pPr>
       <w:r>
-        <w:t>Zuerst Rechtsform und Größe wählen und bestätigen (GmbH oder AG, klein / mittel / groß). Ohne Bestätigung startet nichts. Es gibt kein stilles „unbekannt“. Nach der Auswahl zeigt Teil 1, wie viele Fragen gelten. Fragen, die nicht gelten, sind n. a. (Rechtsgrund), nicht „fehlt“. Danach wird nur der Rest geprüft.</w:t>
+        <w:t>Zuerst Rechtsform und Größe wählen und bestätigen (GmbH oder AG, klein / mittel / groß). Ohne Bestätigung startet nichts. Es gibt kein stilles „unbekannt“. Nach der Auswahl zeigt Teil 1, wie viele Fragen gelten. Fragen, die nicht gelten, sind n. a. (Rechtsgrund), nicht „fehlt“. Danach Knopf „Teil 2: Rest prüfen“. Offene Punkte in Excel abarbeiten.</w:t>
       </w:r>
     </w:p>
     <w:p>
@@ -778,7 +778,7 @@
         <w:spacing w:after="60"/>
       </w:pPr>
       <w:r>
-        <w:t>Stufe anklicken, Unterlagen hochladen (PDF oder Word). In Stufe 3 Gesellschaft bestätigen. Teil 1 zeigt die Zahl der Fragen, dann starten. Das Ergebnis landet im Ordner „Ergebnisse“.</w:t>
+        <w:t>Stufe anklicken, Unterlagen hochladen (PDF oder Word). In Stufe 3 Gesellschaft bestätigen. Teil 1 zeigt die Zahl der Fragen, dann Knopf „Teil 2: Rest prüfen“. Offene Punkte in Excel abarbeiten. Das Ergebnis landet im Ordner „Ergebnisse“.</w:t>
       </w:r>
     </w:p>
     <w:p>

</xml_diff>

<commit_message>
Word-Anleitung nennt Installieren-Check, tägliches Anwenden und Pruefen.
Kollegen sehen denselben Stand wie ANLEITUNG.txt: kein stilles FERTIG,
kein Ollama-Rest, keine Streamlit-Datei, Startmenü und Foundry-Tor.

Co-authored-by: svensteiner <svensteiner@users.noreply.github.com>
</commit_message>
<xml_diff>
--- a/LLP Anhangspruefer - Vorstellung und Anleitung.docx
+++ b/LLP Anhangspruefer - Vorstellung und Anleitung.docx
@@ -622,10 +622,7 @@
           </w:tcPr>
           <w:p>
             <w:r>
-              <w:rPr>
-                <w:sz w:val="21"/>
-              </w:rPr>
-              <w:t>Start über Starten.bat, Tools_starten.bat oder die Desktop-Verknüpfung. Keine EXE auf den PC kopieren. Python nur, wenn die IT es auf dem Server eingerichtet hat.</w:t>
+              <w:t>Start über Starten.bat, Tools_starten.bat, llp_start\Start.bat oder die Desktop-Verknüpfung. Keine EXE auf den PC kopieren. Python nur, wenn die IT es auf dem Server eingerichtet hat.</w:t>
             </w:r>
           </w:p>
         </w:tc>
@@ -717,10 +714,7 @@
         <w:spacing w:after="60"/>
       </w:pPr>
       <w:r>
-        <w:rPr>
-          <w:sz w:val="22"/>
-        </w:rPr>
-        <w:t>Einmalig: Doppelklick auf „Installieren.bat“. Es werden nur Desktop-Verknüpfungen angelegt („Anhangsprüfer“, „LLP AI Tools“ und „Text verbessern“). Das Programm wird nicht auf den PC kopiert. Installieren.bat findet _Gemeinsam daneben (Kanzlei-Share) oder die Kopie im Tool-Ordner und stellt Text verbessern auf Foundry um.</w:t>
+        <w:t>Einmalig: Doppelklick auf „Installieren.bat“. Es werden nur Desktop-Verknüpfungen angelegt („Anhangsprüfer“, „LLP AI Tools“ und „Text verbessern“). Das Programm wird nicht auf den PC kopiert. Installieren.bat findet _Gemeinsam daneben (Kanzlei-Share) oder die Kopie im Tool-Ordner, stellt Text verbessern auf Foundry um und zeigt danach denselben Stand wie Pruefen.bat: kein Streamlit, keine Streamlit-Datei, keine alte EXE, kein Ollama-Rest. Bleibt ein alter Weg, sagt Installieren das klar. Starten.bat und das Startmenü tun dasselbe leise bei jedem Start, falls jemand rephraser neu kopiert.</w:t>
       </w:r>
     </w:p>
     <w:p>
@@ -754,10 +748,7 @@
         <w:spacing w:after="60"/>
       </w:pPr>
       <w:r>
-        <w:rPr>
-          <w:sz w:val="22"/>
-        </w:rPr>
-        <w:t>Doppelklick auf die Desktop-Verknüpfung „Anhangsprüfer“. Der Browser öffnet sich automatisch. Alle LLP-Tools: „LLP AI Tools“ oder Tools_starten.bat. „Text verbessern“ auf dem Desktop ist nur Foundry, nicht Mistral. TEXT VERBESSERN.cmd im Tool-Ordner ist dasselbe Foundry-Tor, nicht Mistral. Zum Beenden dort den Knopf Beenden. Kurzanleitung auf dem Share: _Gemeinsam\ANLEITUNG.txt.</w:t>
+        <w:t>Doppelklick auf die Desktop-Verknüpfung „Anhangsprüfer“. Der Browser öffnet sich automatisch. Alle LLP-Tools: „LLP AI Tools“, Tools_starten.bat oder _Gemeinsam\llp_start\Start.bat. „Text verbessern“ auf dem Desktop ist nur Foundry, nicht Mistral. TEXT VERBESSERN.cmd und start_windows.ps1 im Tool-Ordner sind dasselbe Foundry-Tor, nicht Mistral und nicht Streamlit. Zum Beenden dort den Knopf Beenden. Kurzanleitung auf dem Share: _Gemeinsam\ANLEITUNG.txt.</w:t>
       </w:r>
     </w:p>
     <w:p>
@@ -1103,7 +1094,7 @@
         </w:pBdr>
       </w:pPr>
       <w:r>
-        <w:t>LLP Wirtschaftsprüfung · KI nur über den bestehenden Foundry-Zugang (llp_ai). Status ohne Schlüssel: _Gemeinsam\Pruefen.bat. Ohne Foundry arbeitet das Tool mit der Heuristik. Pseudokrat bleibt lokal. Alle Ergebnisse sind Prüfungsunterstützung und vom Abschlussprüfer zu validieren.</w:t>
+        <w:t>LLP Wirtschaftsprüfung · KI nur über den bestehenden Foundry-Zugang (llp_ai), dieselbe .env wie bisher, nicht neu anlegen. Status ohne Schlüssel: _Gemeinsam\Pruefen.bat (kein Streamlit, keine Streamlit-Datei, keine alte EXE, kein Ollama-Rest, Mistral-Client abgeschaltet). Ohne Foundry arbeitet das Tool mit der Heuristik. Text verbessern sagt klar Bescheid. Pseudokrat bleibt lokal, ohne Foundry. Alle Ergebnisse sind Prüfungsunterstützung und vom Abschlussprüfer zu validieren.</w:t>
       </w:r>
     </w:p>
     <w:sectPr>

</xml_diff>

<commit_message>
Start zeigt Apply-Fehler und alte Restwege bei Text verbessern.
--leise bleibt still, wenn der Nachbarordner fehlt, gibt aber 2
zurück, wenn Anwenden scheitert. Pruefen --rest warnt nur bei
alten Mistral/Streamlit/EXE-Wegen, nicht wenn rephraser fehlt.

Co-authored-by: svensteiner <svensteiner@users.noreply.github.com>
</commit_message>
<xml_diff>
--- a/LLP Anhangspruefer - Vorstellung und Anleitung.docx
+++ b/LLP Anhangspruefer - Vorstellung und Anleitung.docx
@@ -714,7 +714,7 @@
         <w:spacing w:after="60"/>
       </w:pPr>
       <w:r>
-        <w:t>Einmalig: Doppelklick auf „Installieren.bat“. Es werden nur Desktop-Verknüpfungen angelegt („Anhangsprüfer“, „LLP AI Tools“ und „Text verbessern“). Das Programm wird nicht auf den PC kopiert. Installieren.bat findet _Gemeinsam daneben (Kanzlei-Share) oder die Kopie im Tool-Ordner, stellt Text verbessern auf Foundry um und zeigt danach denselben Stand wie Pruefen.bat: kein Streamlit, keine Streamlit-Datei, keine alte EXE, kein Ollama-Rest. Bleibt ein alter Weg, sagt Installieren das klar. Starten.bat und das Startmenü tun dasselbe leise bei jedem Start, falls jemand rephraser neu kopiert.</w:t>
+        <w:t>Einmalig: Doppelklick auf „Installieren.bat“. Es werden nur Desktop-Verknüpfungen angelegt („Anhangsprüfer“, „LLP AI Tools“ und „Text verbessern“). Das Programm wird nicht auf den PC kopiert. Installieren.bat findet _Gemeinsam daneben (Kanzlei-Share) oder die Kopie im Tool-Ordner, stellt Text verbessern auf Foundry um und zeigt danach denselben Stand wie Pruefen.bat: kein Streamlit, keine Streamlit-Datei, keine alte EXE, kein Ollama-Rest. Bleibt ein alter Weg, sagt Installieren das klar. Starten.bat und das Startmenü tun dasselbe bei jedem Start, falls jemand rephraser neu kopiert. Klappt Anwenden nicht oder bleibt ein alter Weg, erscheint eine Zeile („Bitte Pruefen.bat“).</w:t>
       </w:r>
     </w:p>
     <w:p>
@@ -748,7 +748,7 @@
         <w:spacing w:after="60"/>
       </w:pPr>
       <w:r>
-        <w:t>Doppelklick auf die Desktop-Verknüpfung „Anhangsprüfer“. Der Browser öffnet sich automatisch. Alle LLP-Tools: „LLP AI Tools“, Tools_starten.bat oder _Gemeinsam\llp_start\Start.bat. „Text verbessern“ auf dem Desktop ist nur Foundry, nicht Mistral. TEXT VERBESSERN.cmd und start_windows.ps1 im Tool-Ordner sind dasselbe Foundry-Tor, nicht Mistral und nicht Streamlit. Zum Beenden dort den Knopf Beenden. Kurzanleitung auf dem Share: _Gemeinsam\ANLEITUNG.txt.</w:t>
+        <w:t>Doppelklick auf die Desktop-Verknüpfung „Anhangsprüfer“. Der Browser öffnet sich automatisch. Alle LLP-Tools: „LLP AI Tools“, Tools_starten.bat oder _Gemeinsam\llp_start\Start.bat. „Text verbessern“ auf dem Desktop ist nur Foundry, nicht Mistral. TEXT VERBESSERN.cmd und start_windows.ps1 im Tool-Ordner sind dasselbe Foundry-Tor, nicht Mistral und nicht Streamlit. Zum Beenden dort den Knopf Beenden. Kurzanleitung auf dem Share: _Gemeinsam\ANLEITUNG.txt. Bleibt beim Start ein alter Weg, erscheint eine Zeile („Bitte Pruefen.bat“).</w:t>
       </w:r>
     </w:p>
     <w:p>

</xml_diff>

<commit_message>
Anleitung nennt den geparkten Offline-Editor (HTML und JS).
Word, WERKZEUGE und die Texttests erwähnen dasselbe wie Pruefen.bat: keine alte Offline-HTML, kein Editor-Skript.

Co-authored-by: svensteiner <svensteiner@users.noreply.github.com>
</commit_message>
<xml_diff>
--- a/LLP Anhangspruefer - Vorstellung und Anleitung.docx
+++ b/LLP Anhangspruefer - Vorstellung und Anleitung.docx
@@ -714,7 +714,7 @@
         <w:spacing w:after="60"/>
       </w:pPr>
       <w:r>
-        <w:t>Einmalig: Doppelklick auf „Installieren.bat“. Es werden nur Desktop-Verknüpfungen angelegt („Anhangsprüfer“, „LLP AI Tools“ und „Text verbessern“). Das Programm wird nicht auf den PC kopiert. Installieren.bat findet _Gemeinsam daneben (Kanzlei-Share) oder die Kopie im Tool-Ordner, stellt Text verbessern auf Foundry um und zeigt danach denselben Stand wie Pruefen.bat: kein Streamlit, keine Streamlit-Datei, keine alte EXE, kein Ollama-Rest. Bleibt ein alter Weg, sagt Installieren das klar. Starten.bat und das Startmenü tun dasselbe bei jedem Start, falls jemand rephraser neu kopiert. Klappt Anwenden nicht oder bleibt ein alter Weg, erscheint eine Zeile („Bitte Pruefen.bat“).</w:t>
+        <w:t>Einmalig: Doppelklick auf „Installieren.bat“. Es werden nur Desktop-Verknüpfungen angelegt („Anhangsprüfer“, „LLP AI Tools“ und „Text verbessern“). Das Programm wird nicht auf den PC kopiert. Installieren.bat findet _Gemeinsam daneben (Kanzlei-Share) oder die Kopie im Tool-Ordner, stellt Text verbessern auf Foundry um und zeigt danach denselben Stand wie Pruefen.bat: kein Streamlit, keine Streamlit-Datei, keine alte EXE, kein Ollama-Rest, keine alte Offline-HTML, kein Offline-Editor-Skript. Bleibt ein alter Weg, sagt Installieren das klar. Starten.bat und das Startmenü tun dasselbe bei jedem Start, falls jemand rephraser neu kopiert. Klappt Anwenden nicht oder bleibt ein alter Weg, erscheint eine Zeile („Bitte Pruefen.bat“).</w:t>
       </w:r>
     </w:p>
     <w:p>
@@ -1094,7 +1094,7 @@
         </w:pBdr>
       </w:pPr>
       <w:r>
-        <w:t>LLP Wirtschaftsprüfung · KI nur über den bestehenden Foundry-Zugang (llp_ai), dieselbe .env wie bisher, nicht neu anlegen. Status ohne Schlüssel: _Gemeinsam\Pruefen.bat (kein Streamlit, keine Streamlit-Datei, keine alte EXE, kein Ollama-Rest, Mistral-Client abgeschaltet). Ohne Foundry arbeitet das Tool mit der Heuristik. Text verbessern sagt klar Bescheid. Pseudokrat bleibt lokal, ohne Foundry. Alle Ergebnisse sind Prüfungsunterstützung und vom Abschlussprüfer zu validieren.</w:t>
+        <w:t>LLP Wirtschaftsprüfung · KI nur über den bestehenden Foundry-Zugang (llp_ai), dieselbe .env wie bisher, nicht neu anlegen. Status ohne Schlüssel: _Gemeinsam\Pruefen.bat (kein Streamlit, keine Streamlit-Datei, keine alte EXE, kein Ollama-Rest, Mistral-Client abgeschaltet, keine alte Offline-HTML, kein Offline-Editor-Skript). Ohne Foundry arbeitet das Tool mit der Heuristik. Text verbessern sagt klar Bescheid. Pseudokrat bleibt lokal, ohne Foundry. Alle Ergebnisse sind Prüfungsunterstützung und vom Abschlussprüfer zu validieren.</w:t>
       </w:r>
     </w:p>
     <w:sectPr>

</xml_diff>

<commit_message>
Anwenden legt startbare Sicherungen still und schaltet die alte CLI ab.
HTML/PS1/CMD/JS-.llp-alt werden zum Hinweis; das Original liegt in _llp_parked als Textdatei. editorial-transformer und python -m app.main starten nicht mehr. Pruefen.bat meldet beides als Restweg.

Co-authored-by: svensteiner <svensteiner@users.noreply.github.com>
</commit_message>
<xml_diff>
--- a/LLP Anhangspruefer - Vorstellung und Anleitung.docx
+++ b/LLP Anhangspruefer - Vorstellung und Anleitung.docx
@@ -714,7 +714,7 @@
         <w:spacing w:after="60"/>
       </w:pPr>
       <w:r>
-        <w:t>Einmalig: Doppelklick auf „Installieren.bat“. Es werden nur Desktop-Verknüpfungen angelegt („Anhangsprüfer“, „LLP AI Tools“ und „Text verbessern“). Das Programm wird nicht auf den PC kopiert. Installieren.bat findet _Gemeinsam daneben (Kanzlei-Share) oder die Kopie im Tool-Ordner, stellt Text verbessern auf Foundry um und zeigt danach denselben Stand wie Pruefen.bat: kein Streamlit, keine Streamlit-Datei, keine alte EXE, kein Ollama-Rest, keine alte Offline-HTML, kein Offline-Editor-Skript. Bleibt ein alter Weg, sagt Installieren das klar. Starten.bat und das Startmenü tun dasselbe bei jedem Start, falls jemand rephraser neu kopiert. Klappt Anwenden nicht oder bleibt ein alter Weg, erscheint eine Zeile („Bitte Pruefen.bat“).</w:t>
+        <w:t>Einmalig: Doppelklick auf „Installieren.bat“. Es werden nur Desktop-Verknüpfungen angelegt („Anhangsprüfer“, „LLP AI Tools“ und „Text verbessern“). Das Programm wird nicht auf den PC kopiert. Installieren.bat findet _Gemeinsam daneben (Kanzlei-Share) oder die Kopie im Tool-Ordner, stellt Text verbessern auf Foundry um und zeigt danach denselben Stand wie Pruefen.bat: kein Streamlit, keine Streamlit-Datei, keine alte EXE, kein Ollama-Rest, keine alte Offline-HTML, kein Offline-Editor-Skript, keine startbare Sicherung, keine alte Kommandozeile. Bleibt ein alter Weg, sagt Installieren das klar. Starten.bat und das Startmenü tun dasselbe bei jedem Start, falls jemand rephraser neu kopiert. Klappt Anwenden nicht oder bleibt ein alter Weg, erscheint eine Zeile („Bitte Pruefen.bat“).</w:t>
       </w:r>
     </w:p>
     <w:p>
@@ -1094,7 +1094,7 @@
         </w:pBdr>
       </w:pPr>
       <w:r>
-        <w:t>LLP Wirtschaftsprüfung · KI nur über den bestehenden Foundry-Zugang (llp_ai), dieselbe .env wie bisher, nicht neu anlegen. Status ohne Schlüssel: _Gemeinsam\Pruefen.bat (kein Streamlit, keine Streamlit-Datei, keine alte EXE, kein Ollama-Rest, Mistral-Client abgeschaltet, keine alte Offline-HTML, kein Offline-Editor-Skript). Ohne Foundry arbeitet das Tool mit der Heuristik. Text verbessern sagt klar Bescheid. Pseudokrat bleibt lokal, ohne Foundry. Alle Ergebnisse sind Prüfungsunterstützung und vom Abschlussprüfer zu validieren.</w:t>
+        <w:t>LLP Wirtschaftsprüfung · KI nur über den bestehenden Foundry-Zugang (llp_ai), dieselbe .env wie bisher, nicht neu anlegen. Status ohne Schlüssel: _Gemeinsam\Pruefen.bat (kein Streamlit, keine Streamlit-Datei, keine alte EXE, kein Ollama-Rest, Mistral-Client abgeschaltet, keine alte Offline-HTML, kein Offline-Editor-Skript, keine startbare Sicherung, keine alte Kommandozeile). Ohne Foundry arbeitet das Tool mit der Heuristik. Text verbessern sagt klar Bescheid. Pseudokrat bleibt lokal, ohne Foundry. Alle Ergebnisse sind Prüfungsunterstützung und vom Abschlussprüfer zu validieren.</w:t>
       </w:r>
     </w:p>
     <w:sectPr>

</xml_diff>

<commit_message>
Anwenden stellt die lokale Bewertungs-Pipeline ab; Anleitung nennt Selbsttest und Bewertung.
python -m app.evaluation startet sonst noch run_pipeline mit Regeln. Pruefen.bat zeigt den Restweg.

Co-authored-by: svensteiner <svensteiner@users.noreply.github.com>
</commit_message>
<xml_diff>
--- a/LLP Anhangspruefer - Vorstellung und Anleitung.docx
+++ b/LLP Anhangspruefer - Vorstellung und Anleitung.docx
@@ -714,7 +714,7 @@
         <w:spacing w:after="60"/>
       </w:pPr>
       <w:r>
-        <w:t>Einmalig: Doppelklick auf „Installieren.bat“. Es werden nur Desktop-Verknüpfungen angelegt („Anhangsprüfer“, „LLP AI Tools“ und „Text verbessern“). Das Programm wird nicht auf den PC kopiert. Installieren.bat findet _Gemeinsam daneben (Kanzlei-Share) oder die Kopie im Tool-Ordner, stellt Text verbessern auf Foundry um und zeigt danach denselben Stand wie Pruefen.bat: kein Streamlit, keine Streamlit-Datei, keine alte EXE, kein Ollama-Rest, keine alte Offline-HTML, kein Offline-Editor-Skript, keine startbare Sicherung, keine alte Kommandozeile. Bleibt ein alter Weg, sagt Installieren das klar. Starten.bat und das Startmenü tun dasselbe bei jedem Start, falls jemand rephraser neu kopiert. Klappt Anwenden nicht oder bleibt ein alter Weg, erscheint eine Zeile („Bitte Pruefen.bat“).</w:t>
+        <w:t>Einmalig: Doppelklick auf „Installieren.bat“. Es werden nur Desktop-Verknüpfungen angelegt („Anhangsprüfer“, „LLP AI Tools“ und „Text verbessern“). Das Programm wird nicht auf den PC kopiert. Installieren.bat findet _Gemeinsam daneben (Kanzlei-Share) oder die Kopie im Tool-Ordner, stellt Text verbessern auf Foundry um und zeigt danach denselben Stand wie Pruefen.bat: kein Streamlit, keine Streamlit-Datei, keine alte EXE, kein Ollama-Rest, keine alte Offline-HTML, kein Offline-Editor-Skript, keine startbare Sicherung, keine alte Kommandozeile, keinen Desktop-Selbsttest, keine lokale Bewertung. Bleibt ein alter Weg, sagt Installieren das klar. Starten.bat und das Startmenü tun dasselbe bei jedem Start, falls jemand rephraser neu kopiert. Klappt Anwenden nicht oder bleibt ein alter Weg, erscheint eine Zeile („Bitte Pruefen.bat“).</w:t>
       </w:r>
     </w:p>
     <w:p>
@@ -1094,7 +1094,7 @@
         </w:pBdr>
       </w:pPr>
       <w:r>
-        <w:t>LLP Wirtschaftsprüfung · KI nur über den bestehenden Foundry-Zugang (llp_ai), dieselbe .env wie bisher, nicht neu anlegen. Status ohne Schlüssel: _Gemeinsam\Pruefen.bat (kein Streamlit, keine Streamlit-Datei, keine alte EXE, kein Ollama-Rest, Mistral-Client abgeschaltet, keine alte Offline-HTML, kein Offline-Editor-Skript, keine startbare Sicherung, keine alte Kommandozeile). Ohne Foundry arbeitet das Tool mit der Heuristik. Text verbessern sagt klar Bescheid. Pseudokrat bleibt lokal, ohne Foundry. Alle Ergebnisse sind Prüfungsunterstützung und vom Abschlussprüfer zu validieren.</w:t>
+        <w:t>LLP Wirtschaftsprüfung · KI nur über den bestehenden Foundry-Zugang (llp_ai), dieselbe .env wie bisher, nicht neu anlegen. Status ohne Schlüssel: _Gemeinsam\Pruefen.bat (kein Streamlit, keine Streamlit-Datei, keine alte EXE, kein Ollama-Rest, Mistral-Client abgeschaltet, keine alte Offline-HTML, kein Offline-Editor-Skript, keine startbare Sicherung, keine alte Kommandozeile, keinen Desktop-Selbsttest, keine lokale Bewertung). Ohne Foundry arbeitet das Tool mit der Heuristik. Text verbessern sagt klar Bescheid. Pseudokrat bleibt lokal, ohne Foundry. Alle Ergebnisse sind Prüfungsunterstützung und vom Abschlussprüfer zu validieren.</w:t>
       </w:r>
     </w:p>
     <w:sectPr>

</xml_diff>

<commit_message>
Anwenden räumt lokale-Fassung-Texte in der alten Desktop-Oberfläche.
Ohne Foundry bleibt der Text unverändert. Pruefen.bat zeigt den Rest Regelfassung.

Co-authored-by: svensteiner <svensteiner@users.noreply.github.com>
</commit_message>
<xml_diff>
--- a/LLP Anhangspruefer - Vorstellung und Anleitung.docx
+++ b/LLP Anhangspruefer - Vorstellung und Anleitung.docx
@@ -714,7 +714,7 @@
         <w:spacing w:after="60"/>
       </w:pPr>
       <w:r>
-        <w:t>Einmalig: Doppelklick auf „Installieren.bat“. Es werden nur Desktop-Verknüpfungen angelegt („Anhangsprüfer“, „LLP AI Tools“ und „Text verbessern“). Das Programm wird nicht auf den PC kopiert. Installieren.bat findet _Gemeinsam daneben (Kanzlei-Share) oder die Kopie im Tool-Ordner, stellt Text verbessern auf Foundry um und zeigt danach denselben Stand wie Pruefen.bat: kein Streamlit, keine Streamlit-Datei, keine alte EXE, kein Ollama-Rest, keine alte Offline-HTML, kein Offline-Editor-Skript, keine startbare Sicherung, keine alte Kommandozeile, keinen Desktop-Selbsttest, keine lokale Bewertung. Bleibt ein alter Weg, sagt Installieren das klar. Starten.bat und das Startmenü tun dasselbe bei jedem Start, falls jemand rephraser neu kopiert. Klappt Anwenden nicht oder bleibt ein alter Weg, erscheint eine Zeile („Bitte Pruefen.bat“).</w:t>
+        <w:t>Einmalig: Doppelklick auf „Installieren.bat“. Es werden nur Desktop-Verknüpfungen angelegt („Anhangsprüfer“, „LLP AI Tools“ und „Text verbessern“). Das Programm wird nicht auf den PC kopiert. Installieren.bat findet _Gemeinsam daneben (Kanzlei-Share) oder die Kopie im Tool-Ordner, stellt Text verbessern auf Foundry um und zeigt danach denselben Stand wie Pruefen.bat: kein Streamlit, keine Streamlit-Datei, keine alte EXE, kein Ollama-Rest, keine alte Offline-HTML, kein Offline-Editor-Skript, keine startbare Sicherung, keine alte Kommandozeile, keinen Desktop-Selbsttest, keine lokale Bewertung, keine lokale Regelfassung. Bleibt ein alter Weg, sagt Installieren das klar. Starten.bat und das Startmenü tun dasselbe bei jedem Start, falls jemand rephraser neu kopiert. Klappt Anwenden nicht oder bleibt ein alter Weg, erscheint eine Zeile („Bitte Pruefen.bat“).</w:t>
       </w:r>
     </w:p>
     <w:p>
@@ -1094,7 +1094,7 @@
         </w:pBdr>
       </w:pPr>
       <w:r>
-        <w:t>LLP Wirtschaftsprüfung · KI nur über den bestehenden Foundry-Zugang (llp_ai), dieselbe .env wie bisher, nicht neu anlegen. Status ohne Schlüssel: _Gemeinsam\Pruefen.bat (kein Streamlit, keine Streamlit-Datei, keine alte EXE, kein Ollama-Rest, Mistral-Client abgeschaltet, keine alte Offline-HTML, kein Offline-Editor-Skript, keine startbare Sicherung, keine alte Kommandozeile, keinen Desktop-Selbsttest, keine lokale Bewertung). Ohne Foundry arbeitet das Tool mit der Heuristik. Text verbessern sagt klar Bescheid. Pseudokrat bleibt lokal, ohne Foundry. Alle Ergebnisse sind Prüfungsunterstützung und vom Abschlussprüfer zu validieren.</w:t>
+        <w:t>LLP Wirtschaftsprüfung · KI nur über den bestehenden Foundry-Zugang (llp_ai), dieselbe .env wie bisher, nicht neu anlegen. Status ohne Schlüssel: _Gemeinsam\Pruefen.bat (kein Streamlit, keine Streamlit-Datei, keine alte EXE, kein Ollama-Rest, Mistral-Client abgeschaltet, keine alte Offline-HTML, kein Offline-Editor-Skript, keine startbare Sicherung, keine alte Kommandozeile, keinen Desktop-Selbsttest, keine lokale Bewertung, keine lokale Regelfassung). Ohne Foundry arbeitet das Tool mit der Heuristik. Text verbessern sagt klar Bescheid. Pseudokrat bleibt lokal, ohne Foundry. Alle Ergebnisse sind Prüfungsunterstützung und vom Abschlussprüfer zu validieren.</w:t>
       </w:r>
     </w:p>
     <w:sectPr>

</xml_diff>

<commit_message>
Anwenden parkt CI-Rezepte für Bewertung und Offline-Editor.
tests.yml und pages.yml werden wie windows-portable.yml zur Seite gelegt. Pruefen.bat und die Anleitung nennen den Restweg CI-Rezept.

Co-authored-by: svensteiner <svensteiner@users.noreply.github.com>
</commit_message>
<xml_diff>
--- a/LLP Anhangspruefer - Vorstellung und Anleitung.docx
+++ b/LLP Anhangspruefer - Vorstellung und Anleitung.docx
@@ -714,7 +714,7 @@
         <w:spacing w:after="60"/>
       </w:pPr>
       <w:r>
-        <w:t>Einmalig: Doppelklick auf „Installieren.bat“. Es werden nur Desktop-Verknüpfungen angelegt („Anhangsprüfer“, „LLP AI Tools“ und „Text verbessern“). Das Programm wird nicht auf den PC kopiert. Installieren.bat findet _Gemeinsam daneben (Kanzlei-Share) oder die Kopie im Tool-Ordner, stellt Text verbessern auf Foundry um und zeigt danach denselben Stand wie Pruefen.bat: kein Streamlit, keine Streamlit-Datei, keine alte EXE, kein Ollama-Rest, keine alte Offline-HTML, kein Offline-Editor-Skript, keine startbare Sicherung, keine alte Kommandozeile, keinen Desktop-Selbsttest, keine lokale Bewertung, keine lokale Regelfassung. Bleibt ein alter Weg, sagt Installieren das klar. Starten.bat und das Startmenü tun dasselbe bei jedem Start, falls jemand rephraser neu kopiert. Klappt Anwenden nicht oder bleibt ein alter Weg, erscheint eine Zeile („Bitte Pruefen.bat“).</w:t>
+        <w:t>Einmalig: Doppelklick auf „Installieren.bat“. Es werden nur Desktop-Verknüpfungen angelegt („Anhangsprüfer“, „LLP AI Tools“ und „Text verbessern“). Das Programm wird nicht auf den PC kopiert. Installieren.bat findet _Gemeinsam daneben (Kanzlei-Share) oder die Kopie im Tool-Ordner, stellt Text verbessern auf Foundry um und zeigt danach denselben Stand wie Pruefen.bat: kein Streamlit, keine Streamlit-Datei, keine alte EXE, kein Ollama-Rest, keine alte Offline-HTML, kein Offline-Editor-Skript, keine startbare Sicherung, keine alte Kommandozeile, keinen Desktop-Selbsttest, keine lokale Bewertung, keine lokale Regelfassung, keine CI-Rezepte (Bewertung oder Offline-Editor). Bleibt ein alter Weg, sagt Installieren das klar. Starten.bat und das Startmenü tun dasselbe bei jedem Start, falls jemand rephraser neu kopiert. Klappt Anwenden nicht oder bleibt ein alter Weg, erscheint eine Zeile („Bitte Pruefen.bat“).</w:t>
       </w:r>
     </w:p>
     <w:p>
@@ -1094,7 +1094,7 @@
         </w:pBdr>
       </w:pPr>
       <w:r>
-        <w:t>LLP Wirtschaftsprüfung · KI nur über den bestehenden Foundry-Zugang (llp_ai), dieselbe .env wie bisher, nicht neu anlegen. Status ohne Schlüssel: _Gemeinsam\Pruefen.bat (kein Streamlit, keine Streamlit-Datei, keine alte EXE, kein Ollama-Rest, Mistral-Client abgeschaltet, keine alte Offline-HTML, kein Offline-Editor-Skript, keine startbare Sicherung, keine alte Kommandozeile, keinen Desktop-Selbsttest, keine lokale Bewertung, keine lokale Regelfassung). Ohne Foundry arbeitet das Tool mit der Heuristik. Text verbessern sagt klar Bescheid. Pseudokrat bleibt lokal, ohne Foundry. Alle Ergebnisse sind Prüfungsunterstützung und vom Abschlussprüfer zu validieren.</w:t>
+        <w:t>LLP Wirtschaftsprüfung · KI nur über den bestehenden Foundry-Zugang (llp_ai), dieselbe .env wie bisher, nicht neu anlegen. Status ohne Schlüssel: _Gemeinsam\Pruefen.bat (kein Streamlit, keine Streamlit-Datei, keine alte EXE, kein Ollama-Rest, Mistral-Client abgeschaltet, keine alte Offline-HTML, kein Offline-Editor-Skript, keine startbare Sicherung, keine alte Kommandozeile, keinen Desktop-Selbsttest, keine lokale Bewertung, keine lokale Regelfassung, keine CI-Rezepte). Ohne Foundry arbeitet das Tool mit der Heuristik. Text verbessern sagt klar Bescheid. Pseudokrat bleibt lokal, ohne Foundry. Alle Ergebnisse sind Prüfungsunterstützung und vom Abschlussprüfer zu validieren.</w:t>
       </w:r>
     </w:p>
     <w:sectPr>

</xml_diff>

<commit_message>
Anhangsprüfer: LocalLLM ruft Ollama nicht mehr an.
generate_json und is_available sind aus. Pruefen.bat nennt den Restweg Anhang-Ollama.

Co-authored-by: svensteiner <svensteiner@users.noreply.github.com>
</commit_message>
<xml_diff>
--- a/LLP Anhangspruefer - Vorstellung und Anleitung.docx
+++ b/LLP Anhangspruefer - Vorstellung und Anleitung.docx
@@ -714,7 +714,7 @@
         <w:spacing w:after="60"/>
       </w:pPr>
       <w:r>
-        <w:t>Einmalig: Doppelklick auf „Installieren.bat“. Es werden nur Desktop-Verknüpfungen angelegt („Anhangsprüfer“, „LLP AI Tools“ und „Text verbessern“). Das Programm wird nicht auf den PC kopiert. Installieren.bat findet _Gemeinsam daneben (Kanzlei-Share) oder die Kopie im Tool-Ordner, stellt Text verbessern auf Foundry um und zeigt danach denselben Stand wie Pruefen.bat: kein Streamlit, keine Streamlit-Datei, keine alte EXE, kein Ollama-Rest, keine alte Offline-HTML, kein Offline-Editor-Skript, keine startbare Sicherung, keine alte Kommandozeile, keinen Desktop-Selbsttest, keine lokale Bewertung, keine lokale Regelfassung, keine CI-Rezepte (Bewertung oder Offline-Editor). Bleibt ein alter Weg, sagt Installieren das klar. Starten.bat und das Startmenü tun dasselbe bei jedem Start, falls jemand rephraser neu kopiert. Klappt Anwenden nicht oder bleibt ein alter Weg, erscheint eine Zeile („Bitte Pruefen.bat“).</w:t>
+        <w:t>Einmalig: Doppelklick auf „Installieren.bat“. Es werden nur Desktop-Verknüpfungen angelegt („Anhangsprüfer“, „LLP AI Tools“ und „Text verbessern“). Das Programm wird nicht auf den PC kopiert. Installieren.bat findet _Gemeinsam daneben (Kanzlei-Share) oder die Kopie im Tool-Ordner, stellt Text verbessern auf Foundry um und zeigt danach denselben Stand wie Pruefen.bat: kein Streamlit, keine Streamlit-Datei, keine alte EXE, kein Ollama-Rest, keine alte Offline-HTML, kein Offline-Editor-Skript, keine startbare Sicherung, keine alte Kommandozeile, keinen Desktop-Selbsttest, keine lokale Bewertung, keine lokale Regelfassung, keine CI-Rezepte (Bewertung oder Offline-Editor), keinen Ollama-Client im Anhangspruefer. Bleibt ein alter Weg, sagt Installieren das klar. Starten.bat und das Startmenü tun dasselbe bei jedem Start, falls jemand rephraser neu kopiert. Klappt Anwenden nicht oder bleibt ein alter Weg, erscheint eine Zeile („Bitte Pruefen.bat“).</w:t>
       </w:r>
     </w:p>
     <w:p>
@@ -1094,7 +1094,7 @@
         </w:pBdr>
       </w:pPr>
       <w:r>
-        <w:t>LLP Wirtschaftsprüfung · KI nur über den bestehenden Foundry-Zugang (llp_ai), dieselbe .env wie bisher, nicht neu anlegen. Status ohne Schlüssel: _Gemeinsam\Pruefen.bat (kein Streamlit, keine Streamlit-Datei, keine alte EXE, kein Ollama-Rest, Mistral-Client abgeschaltet, keine alte Offline-HTML, kein Offline-Editor-Skript, keine startbare Sicherung, keine alte Kommandozeile, keinen Desktop-Selbsttest, keine lokale Bewertung, keine lokale Regelfassung, keine CI-Rezepte). Ohne Foundry arbeitet das Tool mit der Heuristik. Text verbessern sagt klar Bescheid. Pseudokrat bleibt lokal, ohne Foundry. Alle Ergebnisse sind Prüfungsunterstützung und vom Abschlussprüfer zu validieren.</w:t>
+        <w:t>LLP Wirtschaftsprüfung · KI nur über den bestehenden Foundry-Zugang (llp_ai), dieselbe .env wie bisher, nicht neu anlegen. Status ohne Schlüssel: _Gemeinsam\Pruefen.bat (kein Streamlit, keine Streamlit-Datei, keine alte EXE, kein Ollama-Rest, Mistral-Client abgeschaltet, keine alte Offline-HTML, kein Offline-Editor-Skript, keine startbare Sicherung, keine alte Kommandozeile, keinen Desktop-Selbsttest, keine lokale Bewertung, keine lokale Regelfassung, keine CI-Rezepte, keinen Ollama-Client im Anhangspruefer). Ohne Foundry arbeitet das Tool mit der Heuristik. Text verbessern sagt klar Bescheid. Pseudokrat bleibt lokal, ohne Foundry. Alle Ergebnisse sind Prüfungsunterstützung und vom Abschlussprüfer zu validieren.</w:t>
       </w:r>
     </w:p>
     <w:sectPr>

</xml_diff>

<commit_message>
Anwenden schaltet OpenAI- und Anthropic-Adapter ab.
rewrite wirft. Pruefen.bat nennt den Restweg Fremd-KI, wenn der Tor-Hinweis fehlt.

Co-authored-by: svensteiner <svensteiner@users.noreply.github.com>
</commit_message>
<xml_diff>
--- a/LLP Anhangspruefer - Vorstellung und Anleitung.docx
+++ b/LLP Anhangspruefer - Vorstellung und Anleitung.docx
@@ -714,7 +714,7 @@
         <w:spacing w:after="60"/>
       </w:pPr>
       <w:r>
-        <w:t>Einmalig: Doppelklick auf „Installieren.bat“. Es werden nur Desktop-Verknüpfungen angelegt („Anhangsprüfer“, „LLP AI Tools“ und „Text verbessern“). Das Programm wird nicht auf den PC kopiert. Installieren.bat findet _Gemeinsam daneben (Kanzlei-Share) oder die Kopie im Tool-Ordner, stellt Text verbessern auf Foundry um und zeigt danach denselben Stand wie Pruefen.bat: kein Streamlit, keine Streamlit-Datei, keine alte EXE, kein Ollama-Rest, keine alte Offline-HTML, kein Offline-Editor-Skript, keine startbare Sicherung, keine alte Kommandozeile, keinen Desktop-Selbsttest, keine lokale Bewertung, keine lokale Regelfassung, keine CI-Rezepte (Bewertung oder Offline-Editor), keinen Ollama-Client im Anhangspruefer. Bleibt ein alter Weg, sagt Installieren das klar. Starten.bat und das Startmenü tun dasselbe bei jedem Start, falls jemand rephraser neu kopiert. Klappt Anwenden nicht oder bleibt ein alter Weg, erscheint eine Zeile („Bitte Pruefen.bat“).</w:t>
+        <w:t>Einmalig: Doppelklick auf „Installieren.bat“. Es werden nur Desktop-Verknüpfungen angelegt („Anhangsprüfer“, „LLP AI Tools“ und „Text verbessern“). Das Programm wird nicht auf den PC kopiert. Installieren.bat findet _Gemeinsam daneben (Kanzlei-Share) oder die Kopie im Tool-Ordner, stellt Text verbessern auf Foundry um und zeigt danach denselben Stand wie Pruefen.bat: kein Streamlit, keine Streamlit-Datei, keine alte EXE, kein Ollama-Rest, keine alte Offline-HTML, kein Offline-Editor-Skript, keine startbare Sicherung, keine alte Kommandozeile, keinen Desktop-Selbsttest, keine lokale Bewertung, keine lokale Regelfassung, keine CI-Rezepte (Bewertung oder Offline-Editor), keinen Ollama-Client im Anhangspruefer, keine Fremd-KI (OpenAI/Anthropic). Bleibt ein alter Weg, sagt Installieren das klar. Starten.bat und das Startmenü tun dasselbe bei jedem Start, falls jemand rephraser neu kopiert. Klappt Anwenden nicht oder bleibt ein alter Weg, erscheint eine Zeile („Bitte Pruefen.bat“).</w:t>
       </w:r>
     </w:p>
     <w:p>
@@ -1094,7 +1094,7 @@
         </w:pBdr>
       </w:pPr>
       <w:r>
-        <w:t>LLP Wirtschaftsprüfung · KI nur über den bestehenden Foundry-Zugang (llp_ai), dieselbe .env wie bisher, nicht neu anlegen. Status ohne Schlüssel: _Gemeinsam\Pruefen.bat (kein Streamlit, keine Streamlit-Datei, keine alte EXE, kein Ollama-Rest, Mistral-Client abgeschaltet, keine alte Offline-HTML, kein Offline-Editor-Skript, keine startbare Sicherung, keine alte Kommandozeile, keinen Desktop-Selbsttest, keine lokale Bewertung, keine lokale Regelfassung, keine CI-Rezepte, keinen Ollama-Client im Anhangspruefer). Ohne Foundry arbeitet das Tool mit der Heuristik. Text verbessern sagt klar Bescheid. Pseudokrat bleibt lokal, ohne Foundry. Alle Ergebnisse sind Prüfungsunterstützung und vom Abschlussprüfer zu validieren.</w:t>
+        <w:t>LLP Wirtschaftsprüfung · KI nur über den bestehenden Foundry-Zugang (llp_ai), dieselbe .env wie bisher, nicht neu anlegen. Status ohne Schlüssel: _Gemeinsam\Pruefen.bat (kein Streamlit, keine Streamlit-Datei, keine alte EXE, kein Ollama-Rest, Mistral-Client abgeschaltet, keine alte Offline-HTML, kein Offline-Editor-Skript, keine startbare Sicherung, keine alte Kommandozeile, keinen Desktop-Selbsttest, keine lokale Bewertung, keine lokale Regelfassung, keine CI-Rezepte, keinen Ollama-Client im Anhangspruefer, keine Fremd-KI). Ohne Foundry arbeitet das Tool mit der Heuristik. Text verbessern sagt klar Bescheid. Pseudokrat bleibt lokal, ohne Foundry. Alle Ergebnisse sind Prüfungsunterstützung und vom Abschlussprüfer zu validieren.</w:t>
       </w:r>
     </w:p>
     <w:sectPr>

</xml_diff>

<commit_message>
Anwenden entfernt den toten Regelaufruf im Schnell-Editor.
Pruefen zählt LocalRuleProvider().rewrite auch nach dem Foundry-Tor
als Restweg. Anwenden ersetzt den Aufruf, die Anleitung nennt den
Schnell-Editor.

Co-authored-by: svensteiner <svensteiner@users.noreply.github.com>
</commit_message>
<xml_diff>
--- a/LLP Anhangspruefer - Vorstellung und Anleitung.docx
+++ b/LLP Anhangspruefer - Vorstellung und Anleitung.docx
@@ -714,7 +714,7 @@
         <w:spacing w:after="60"/>
       </w:pPr>
       <w:r>
-        <w:t>Einmalig: Doppelklick auf „Installieren.bat“. Es werden nur Desktop-Verknüpfungen angelegt („Anhangsprüfer“, „LLP AI Tools“ und „Text verbessern“). Das Programm wird nicht auf den PC kopiert. Installieren.bat findet _Gemeinsam daneben (Kanzlei-Share) oder die Kopie im Tool-Ordner, stellt Text verbessern auf Foundry um und zeigt danach denselben Stand wie Pruefen.bat: kein Streamlit, keine Streamlit-Datei, keine alte EXE, kein Ollama-Rest, keine alte Offline-HTML, kein Offline-Editor-Skript, keine startbare Sicherung, keine alte Kommandozeile, keinen Desktop-Selbsttest, keine lokale Bewertung, keine lokale Regelfassung, keine CI-Rezepte (Bewertung oder Offline-Editor), keinen Ollama-Client im Anhangspruefer, keine Fremd-KI (OpenAI/Anthropic). Bleibt ein alter Weg, sagt Installieren das klar. Starten.bat und das Startmenü tun dasselbe bei jedem Start, falls jemand rephraser neu kopiert. Klappt Anwenden nicht oder bleibt ein alter Weg, erscheint eine Zeile („Bitte Pruefen.bat“).</w:t>
+        <w:t>Einmalig: Doppelklick auf „Installieren.bat“. Es werden nur Desktop-Verknüpfungen angelegt („Anhangsprüfer“, „LLP AI Tools“ und „Text verbessern“). Das Programm wird nicht auf den PC kopiert. Installieren.bat findet _Gemeinsam daneben (Kanzlei-Share) oder die Kopie im Tool-Ordner, stellt Text verbessern auf Foundry um und zeigt danach denselben Stand wie Pruefen.bat: kein Streamlit, keine Streamlit-Datei, keine alte EXE, kein Ollama-Rest, keine alte Offline-HTML, kein Offline-Editor-Skript, keine startbare Sicherung, keine alte Kommandozeile, keinen Desktop-Selbsttest, keine lokale Bewertung, keine lokale Regelfassung, keinen Schnell-Editor, keine CI-Rezepte (Bewertung oder Offline-Editor), keinen Ollama-Client im Anhangspruefer, keine Fremd-KI (OpenAI/Anthropic). Bleibt ein alter Weg, sagt Installieren das klar. Starten.bat und das Startmenü tun dasselbe bei jedem Start, falls jemand rephraser neu kopiert. Klappt Anwenden nicht oder bleibt ein alter Weg, erscheint eine Zeile („Bitte Pruefen.bat“).</w:t>
       </w:r>
     </w:p>
     <w:p>
@@ -1094,7 +1094,7 @@
         </w:pBdr>
       </w:pPr>
       <w:r>
-        <w:t>LLP Wirtschaftsprüfung · KI nur über den bestehenden Foundry-Zugang (llp_ai), dieselbe .env wie bisher, nicht neu anlegen. Status ohne Schlüssel: _Gemeinsam\Pruefen.bat (kein Streamlit, keine Streamlit-Datei, keine alte EXE, kein Ollama-Rest, Mistral-Client abgeschaltet, keine alte Offline-HTML, kein Offline-Editor-Skript, keine startbare Sicherung, keine alte Kommandozeile, keinen Desktop-Selbsttest, keine lokale Bewertung, keine lokale Regelfassung, keine CI-Rezepte, keinen Ollama-Client im Anhangspruefer, keine Fremd-KI). Ohne Foundry arbeitet das Tool mit der Heuristik. Text verbessern sagt klar Bescheid. Pseudokrat bleibt lokal, ohne Foundry. Alle Ergebnisse sind Prüfungsunterstützung und vom Abschlussprüfer zu validieren.</w:t>
+        <w:t>LLP Wirtschaftsprüfung · KI nur über den bestehenden Foundry-Zugang (llp_ai), dieselbe .env wie bisher, nicht neu anlegen. Status ohne Schlüssel: _Gemeinsam\Pruefen.bat (kein Streamlit, keine Streamlit-Datei, keine alte EXE, kein Ollama-Rest, Mistral-Client abgeschaltet, keine alte Offline-HTML, kein Offline-Editor-Skript, keine startbare Sicherung, keine alte Kommandozeile, keinen Desktop-Selbsttest, keine lokale Bewertung, keine lokale Regelfassung, keinen Schnell-Editor, keine CI-Rezepte, keinen Ollama-Client im Anhangspruefer, keine Fremd-KI). Ohne Foundry arbeitet das Tool mit der Heuristik. Text verbessern sagt klar Bescheid. Pseudokrat bleibt lokal, ohne Foundry. Alle Ergebnisse sind Prüfungsunterstützung und vom Abschlussprüfer zu validieren.</w:t>
       </w:r>
     </w:p>
     <w:sectPr>

</xml_diff>

<commit_message>
Anwenden entfernt Support-Mistral und parkt alte Tests.
Der Supporttext darf kein lokales Mistral mehr versprechen.
Alte Mistral-/Ollama-Tests in tests/ zählen als Restweg und
werden zur Seite gelegt. Anleitung und Pruefen.bat nennen das.

Co-authored-by: svensteiner <svensteiner@users.noreply.github.com>
</commit_message>
<xml_diff>
--- a/LLP Anhangspruefer - Vorstellung und Anleitung.docx
+++ b/LLP Anhangspruefer - Vorstellung und Anleitung.docx
@@ -714,7 +714,7 @@
         <w:spacing w:after="60"/>
       </w:pPr>
       <w:r>
-        <w:t>Einmalig: Doppelklick auf „Installieren.bat“. Es werden nur Desktop-Verknüpfungen angelegt („Anhangsprüfer“, „LLP AI Tools“ und „Text verbessern“). Das Programm wird nicht auf den PC kopiert. Installieren.bat findet _Gemeinsam daneben (Kanzlei-Share) oder die Kopie im Tool-Ordner, stellt Text verbessern auf Foundry um und zeigt danach denselben Stand wie Pruefen.bat: kein Streamlit, keine Streamlit-Datei, keine alte EXE, kein Ollama-Rest, keine alte Offline-HTML, kein Offline-Editor-Skript, keine startbare Sicherung, keine alte Kommandozeile, keinen Desktop-Selbsttest, keine lokale Bewertung, keine lokale Regelfassung, keinen Schnell-Editor, keine CI-Rezepte (Bewertung oder Offline-Editor), keinen Ollama-Client im Anhangspruefer, keine Fremd-KI (OpenAI/Anthropic). Bleibt ein alter Weg, sagt Installieren das klar. Starten.bat und das Startmenü tun dasselbe bei jedem Start, falls jemand rephraser neu kopiert. Klappt Anwenden nicht oder bleibt ein alter Weg, erscheint eine Zeile („Bitte Pruefen.bat“).</w:t>
+        <w:t>Einmalig: Doppelklick auf „Installieren.bat“. Es werden nur Desktop-Verknüpfungen angelegt („Anhangsprüfer“, „LLP AI Tools“ und „Text verbessern“). Das Programm wird nicht auf den PC kopiert. Installieren.bat findet _Gemeinsam daneben (Kanzlei-Share) oder die Kopie im Tool-Ordner, stellt Text verbessern auf Foundry um und zeigt danach denselben Stand wie Pruefen.bat: kein Streamlit, keine Streamlit-Datei, keine alte EXE, kein Ollama-Rest, keine alte Offline-HTML, kein Offline-Editor-Skript, keine startbare Sicherung, keine alte Kommandozeile, keinen Desktop-Selbsttest, keine lokale Bewertung, keine lokale Regelfassung, keinen Schnell-Editor, keine CI-Rezepte (Bewertung oder Offline-Editor), keine alten Mistral-Tests, keinen Ollama-Client im Anhangspruefer, keine Fremd-KI (OpenAI/Anthropic). Bleibt ein alter Weg, sagt Installieren das klar. Starten.bat und das Startmenü tun dasselbe bei jedem Start, falls jemand rephraser neu kopiert. Klappt Anwenden nicht oder bleibt ein alter Weg, erscheint eine Zeile („Bitte Pruefen.bat“).</w:t>
       </w:r>
     </w:p>
     <w:p>
@@ -1094,7 +1094,7 @@
         </w:pBdr>
       </w:pPr>
       <w:r>
-        <w:t>LLP Wirtschaftsprüfung · KI nur über den bestehenden Foundry-Zugang (llp_ai), dieselbe .env wie bisher, nicht neu anlegen. Status ohne Schlüssel: _Gemeinsam\Pruefen.bat (kein Streamlit, keine Streamlit-Datei, keine alte EXE, kein Ollama-Rest, Mistral-Client abgeschaltet, keine alte Offline-HTML, kein Offline-Editor-Skript, keine startbare Sicherung, keine alte Kommandozeile, keinen Desktop-Selbsttest, keine lokale Bewertung, keine lokale Regelfassung, keinen Schnell-Editor, keine CI-Rezepte, keinen Ollama-Client im Anhangspruefer, keine Fremd-KI). Ohne Foundry arbeitet das Tool mit der Heuristik. Text verbessern sagt klar Bescheid. Pseudokrat bleibt lokal, ohne Foundry. Alle Ergebnisse sind Prüfungsunterstützung und vom Abschlussprüfer zu validieren.</w:t>
+        <w:t>LLP Wirtschaftsprüfung · KI nur über den bestehenden Foundry-Zugang (llp_ai), dieselbe .env wie bisher, nicht neu anlegen. Status ohne Schlüssel: _Gemeinsam\Pruefen.bat (kein Streamlit, keine Streamlit-Datei, keine alte EXE, kein Ollama-Rest, Mistral-Client abgeschaltet, keine alte Offline-HTML, kein Offline-Editor-Skript, keine startbare Sicherung, keine alte Kommandozeile, keinen Desktop-Selbsttest, keine lokale Bewertung, keine lokale Regelfassung, keinen Schnell-Editor, keine CI-Rezepte, keine alten Mistral-Tests, keinen Ollama-Client im Anhangspruefer, keine Fremd-KI). Ohne Foundry arbeitet das Tool mit der Heuristik. Text verbessern sagt klar Bescheid. Pseudokrat bleibt lokal, ohne Foundry. Alle Ergebnisse sind Prüfungsunterstützung und vom Abschlussprüfer zu validieren.</w:t>
       </w:r>
     </w:p>
     <w:sectPr>

</xml_diff>